<commit_message>
Continuação do relatório. Correções.
</commit_message>
<xml_diff>
--- a/semestre2/VAD/Project/Data-Analysis-and-Visualization-Project-Eletrcity/ProgressReport_HenriqueCuraRicardoPina.docx
+++ b/semestre2/VAD/Project/Data-Analysis-and-Visualization-Project-Eletrcity/ProgressReport_HenriqueCuraRicardoPina.docx
@@ -471,43 +471,22 @@
       <w:pPr>
         <w:pStyle w:val="HeadingSection"/>
         <w:rPr>
-          <w:lang w:val="pt-PT"/>
-        </w:rPr>
-      </w:pPr>
-      <w:r>
-        <w:rPr>
-          <w:lang w:val="pt-PT"/>
+          <w:lang w:val="en-GB"/>
+        </w:rPr>
+      </w:pPr>
+      <w:r>
+        <w:rPr>
+          <w:lang w:val="en-GB"/>
         </w:rPr>
         <w:t>2</w:t>
       </w:r>
       <w:r>
         <w:rPr>
-          <w:lang w:val="pt-PT"/>
+          <w:lang w:val="en-GB"/>
         </w:rPr>
         <w:tab/>
-      </w:r>
-      <w:proofErr w:type="spellStart"/>
-      <w:r>
-        <w:rPr>
-          <w:lang w:val="pt-PT"/>
-        </w:rPr>
-        <w:t>Related</w:t>
-      </w:r>
-      <w:proofErr w:type="spellEnd"/>
-      <w:r>
-        <w:rPr>
-          <w:lang w:val="pt-PT"/>
-        </w:rPr>
-        <w:t xml:space="preserve"> </w:t>
-      </w:r>
-      <w:proofErr w:type="spellStart"/>
-      <w:r>
-        <w:rPr>
-          <w:lang w:val="pt-PT"/>
-        </w:rPr>
-        <w:t>Work</w:t>
-      </w:r>
-      <w:proofErr w:type="spellEnd"/>
+        <w:t>Related Work</w:t>
+      </w:r>
     </w:p>
     <w:p>
       <w:pPr>
@@ -2985,15 +2964,205 @@
     </w:p>
     <w:p>
       <w:pPr>
+        <w:pStyle w:val="Text"/>
+        <w:rPr>
+          <w:lang w:val="pt-PT"/>
+        </w:rPr>
+      </w:pPr>
+      <w:r>
+        <w:rPr>
+          <w:lang w:val="pt-PT"/>
+        </w:rPr>
+        <w:t xml:space="preserve">Tal como abordado no </w:t>
+      </w:r>
+      <w:r>
+        <w:rPr>
+          <w:lang w:val="pt-PT"/>
+        </w:rPr>
+        <w:t xml:space="preserve">capitulo anterior, decidimos explorar o nosso tema usando três menus: um para estudar a sazonalidade da produção energética, outro para estudar o efeito das condições meteorológicas </w:t>
+      </w:r>
+      <w:r>
+        <w:rPr>
+          <w:lang w:val="pt-PT"/>
+        </w:rPr>
+        <w:t>na produção das diferentes energias renováveis e por fim um para ver o efeito destes diferentes fatores no preço da energia.</w:t>
+      </w:r>
+    </w:p>
+    <w:p>
+      <w:pPr>
+        <w:pStyle w:val="Text"/>
+        <w:rPr>
+          <w:lang w:val="pt-PT"/>
+        </w:rPr>
+      </w:pPr>
+      <w:r>
+        <w:rPr>
+          <w:lang w:val="pt-PT"/>
+        </w:rPr>
+        <w:t xml:space="preserve">Implementamos estes menus usando </w:t>
+      </w:r>
+      <w:proofErr w:type="spellStart"/>
+      <w:r>
+        <w:rPr>
+          <w:lang w:val="pt-PT"/>
+        </w:rPr>
+        <w:t>tabs</w:t>
+      </w:r>
+      <w:proofErr w:type="spellEnd"/>
+      <w:r>
+        <w:rPr>
+          <w:lang w:val="pt-PT"/>
+        </w:rPr>
+        <w:t xml:space="preserve"> e começando pela primeira, sazonalidade, conseguimos ver no primeiro gráfico a variação da produção energética discriminada por tipo ao longo do </w:t>
+      </w:r>
+      <w:r>
+        <w:rPr>
+          <w:lang w:val="pt-PT"/>
+        </w:rPr>
+        <w:t xml:space="preserve">tempo em estudo. </w:t>
+      </w:r>
+    </w:p>
+    <w:p>
+      <w:pPr>
+        <w:pStyle w:val="Text"/>
+        <w:rPr>
+          <w:lang w:val="pt-PT"/>
+        </w:rPr>
+      </w:pPr>
+      <w:r>
+        <w:rPr>
+          <w:lang w:val="pt-PT"/>
+        </w:rPr>
+        <w:t xml:space="preserve">De maneira semelhante procuramos perceber as tendências </w:t>
+      </w:r>
+      <w:r>
+        <w:rPr>
+          <w:lang w:val="pt-PT"/>
+        </w:rPr>
+        <w:t>das produções usando gráficos circulares. Damos a opção ao utilizador para escolher que tipo de produção pretende visualizar e distinguimos cada ano dando uma cor diferente à barra, mantendo a cor principal de maneira igual aos outros gráficos. Observando estes gráficos circulares é possível perceber as tendências ao longo de um ano, nomeadamente uma menor produção de energia fotovoltaica nos meses de inverno, de hídrica no verão ou de como os meses de verão têm a tendência de ser os meses onde a produção energética total.</w:t>
+      </w:r>
+    </w:p>
+    <w:p>
+      <w:pPr>
+        <w:pStyle w:val="Text"/>
+        <w:rPr>
+          <w:lang w:val="pt-PT"/>
+        </w:rPr>
+      </w:pPr>
+      <w:r>
+        <w:rPr>
+          <w:lang w:val="pt-PT"/>
+        </w:rPr>
+        <w:t>Com o intuito de analisar a evolução de um ano para outro e assim comparar as produções do mesmo mês em anos diferentes procedemos ao desenvolvimento de um gráfico espiral.</w:t>
+      </w:r>
+      <w:r>
+        <w:rPr>
+          <w:lang w:val="pt-PT"/>
+        </w:rPr>
+        <w:t xml:space="preserve"> Para construir este efeito de espiral tivemos de usar o </w:t>
+      </w:r>
+      <w:proofErr w:type="spellStart"/>
+      <w:r>
+        <w:rPr>
+          <w:lang w:val="pt-PT"/>
+        </w:rPr>
+        <w:t>Barpolar</w:t>
+      </w:r>
+      <w:proofErr w:type="spellEnd"/>
+      <w:r>
+        <w:rPr>
+          <w:lang w:val="pt-PT"/>
+        </w:rPr>
+        <w:t xml:space="preserve"> da biblioteca </w:t>
+      </w:r>
+      <w:proofErr w:type="spellStart"/>
+      <w:r>
+        <w:rPr>
+          <w:lang w:val="pt-PT"/>
+        </w:rPr>
+        <w:t>graph_objects</w:t>
+      </w:r>
+      <w:proofErr w:type="spellEnd"/>
+      <w:r>
+        <w:rPr>
+          <w:lang w:val="pt-PT"/>
+        </w:rPr>
+        <w:t xml:space="preserve"> do </w:t>
+      </w:r>
+      <w:proofErr w:type="spellStart"/>
+      <w:r>
+        <w:rPr>
+          <w:lang w:val="pt-PT"/>
+        </w:rPr>
+        <w:t>plotly</w:t>
+      </w:r>
+      <w:proofErr w:type="spellEnd"/>
+      <w:r>
+        <w:rPr>
+          <w:lang w:val="pt-PT"/>
+        </w:rPr>
+        <w:t xml:space="preserve"> </w:t>
+      </w:r>
+      <w:r>
+        <w:rPr>
+          <w:lang w:val="pt-PT"/>
+        </w:rPr>
+        <w:t xml:space="preserve">e aumentar o valor da base conforme se insere barras. O tamanho da barra, r, foi calculado dividindo-se o valor da produção um </w:t>
+      </w:r>
+      <w:proofErr w:type="spellStart"/>
+      <w:r>
+        <w:rPr>
+          <w:lang w:val="pt-PT"/>
+        </w:rPr>
+        <w:t>norm_factor</w:t>
+      </w:r>
+      <w:proofErr w:type="spellEnd"/>
+      <w:r>
+        <w:rPr>
+          <w:lang w:val="pt-PT"/>
+        </w:rPr>
+        <w:t xml:space="preserve"> que corresponde ao valor máximo da produção multiplicado por 0.05 (tendo sido experimentados outros valores e ficado mais satisfeito com os resultados usando este).</w:t>
+      </w:r>
+      <w:r>
+        <w:rPr>
+          <w:lang w:val="pt-PT"/>
+        </w:rPr>
+        <w:t xml:space="preserve"> Também neste gráfico é possível selecionar o tipo de tecnologia usada para a produção energética destacando-se possíveis leituras: o mês de janeiro tem tido sucessivas menores produções de energia hídrica entre 2023 e 2025, enquanto em maio observamos aumentos. Eólica sendo a que mais contribui para o total da produção nacional tem vindo a oscilar pouco nos meses de novembro e dezembro. Para finalizar este segmento, temos um gráfico para permitir a análise mais detalhada de um mês que tenha suscitado curiosidade no utilizador. É-lhe permitido selecionar o mês e ano e também </w:t>
+      </w:r>
+      <w:r>
+        <w:rPr>
+          <w:lang w:val="pt-PT"/>
+        </w:rPr>
+        <w:t xml:space="preserve">o intervalo de tempo para agrupar os valores. Selecionando a janela de valores também é possível reduzir a análise para um dia e ver que  pico de valores em outubro de 2025, por exemplo, entre a 1:00 e 1.45 de dia 26 corresponde à mudança da hora estando assim justificado valores duas vezes maiores do que o expectável já que a hora 1:00-2:00 nesse dia ocorreu duas vezes por assim dizer. </w:t>
+      </w:r>
+    </w:p>
+    <w:p>
+      <w:pPr>
         <w:pStyle w:val="HeadingSection"/>
-      </w:pPr>
-      <w:r>
+        <w:rPr>
+          <w:lang w:val="pt-PT"/>
+        </w:rPr>
+      </w:pPr>
+      <w:r>
+        <w:rPr>
+          <w:lang w:val="pt-PT"/>
+        </w:rPr>
         <w:t>8</w:t>
       </w:r>
       <w:r>
+        <w:rPr>
+          <w:lang w:val="pt-PT"/>
+        </w:rPr>
         <w:tab/>
+      </w:r>
+      <w:proofErr w:type="spellStart"/>
+      <w:r>
+        <w:rPr>
+          <w:lang w:val="pt-PT"/>
+        </w:rPr>
         <w:t>Evaluation</w:t>
       </w:r>
+      <w:proofErr w:type="spellEnd"/>
     </w:p>
     <w:p>
       <w:pPr>
@@ -4499,6 +4668,7 @@
   <w:style w:type="character" w:default="1" w:styleId="Tipodeletrapredefinidodopargrafo">
     <w:name w:val="Default Paragraph Font"/>
     <w:uiPriority w:val="1"/>
+    <w:semiHidden/>
     <w:unhideWhenUsed/>
   </w:style>
   <w:style w:type="table" w:default="1" w:styleId="Tabelanormal">

</xml_diff>

<commit_message>
report implementation pag 2 e 3
</commit_message>
<xml_diff>
--- a/semestre2/VAD/Project/Data-Analysis-and-Visualization-Project-Eletrcity/ProgressReport_HenriqueCuraRicardoPina.docx
+++ b/semestre2/VAD/Project/Data-Analysis-and-Visualization-Project-Eletrcity/ProgressReport_HenriqueCuraRicardoPina.docx
@@ -3169,6 +3169,181 @@
         </w:rPr>
         <w:t xml:space="preserve"> de valores em outubro de 2025, por exemplo, entre a 1:00 e 1.45 de dia 26 corresponde à mudança da hora estando assim justificado valores duas vezes maiores do que o expectável já que a hora 1:00-2:00 nesse dia ocorreu duas vezes por assim dizer. </w:t>
       </w:r>
+    </w:p>
+    <w:p>
+      <w:pPr>
+        <w:pStyle w:val="Text"/>
+        <w:rPr>
+          <w:lang w:val="pt-PT"/>
+        </w:rPr>
+      </w:pPr>
+    </w:p>
+    <w:p>
+      <w:pPr>
+        <w:pStyle w:val="Text"/>
+        <w:rPr>
+          <w:lang w:val="pt-PT"/>
+        </w:rPr>
+      </w:pPr>
+      <w:r>
+        <w:rPr>
+          <w:lang w:val="pt-PT"/>
+        </w:rPr>
+        <w:t xml:space="preserve">Na segunda </w:t>
+      </w:r>
+      <w:proofErr w:type="spellStart"/>
+      <w:r>
+        <w:rPr>
+          <w:lang w:val="pt-PT"/>
+        </w:rPr>
+        <w:t>tab</w:t>
+      </w:r>
+      <w:proofErr w:type="spellEnd"/>
+      <w:r>
+        <w:rPr>
+          <w:lang w:val="pt-PT"/>
+        </w:rPr>
+        <w:t xml:space="preserve"> procurámos estudar o efeito das condições meteorológicas na produção energética renovável. Começámos por implementar um gráfico temporal onde o utilizador </w:t>
+      </w:r>
+      <w:r>
+        <w:rPr>
+          <w:lang w:val="pt-PT"/>
+        </w:rPr>
+        <w:t xml:space="preserve">pode selecionar a variável meteorológica que pretende observar: luz diária de sol, temperatura, velocidade do vento, precipitação ou nebulosidade. Para variáveis como temperatura, vento e nebulosidade optámos por representar os valores mínimo, médio e máximo, permitindo uma leitura mais completa da sua evolução ao longo do período em estudo. No caso da precipitação e da luz solar, representámos a série diária correspondente, </w:t>
+      </w:r>
+      <w:r>
+        <w:rPr>
+          <w:lang w:val="pt-PT"/>
+        </w:rPr>
+        <w:t>mantendo o</w:t>
+      </w:r>
+      <w:r>
+        <w:rPr>
+          <w:lang w:val="pt-PT"/>
+        </w:rPr>
+        <w:t xml:space="preserve"> tipo de interação temporal através do </w:t>
+      </w:r>
+      <w:proofErr w:type="spellStart"/>
+      <w:r>
+        <w:rPr>
+          <w:lang w:val="pt-PT"/>
+        </w:rPr>
+        <w:t>rangeslider</w:t>
+      </w:r>
+      <w:proofErr w:type="spellEnd"/>
+      <w:r>
+        <w:rPr>
+          <w:lang w:val="pt-PT"/>
+        </w:rPr>
+        <w:t>.</w:t>
+      </w:r>
+    </w:p>
+    <w:p>
+      <w:pPr>
+        <w:pStyle w:val="Text"/>
+        <w:rPr>
+          <w:lang w:val="pt-PT"/>
+        </w:rPr>
+      </w:pPr>
+      <w:r>
+        <w:rPr>
+          <w:lang w:val="pt-PT"/>
+        </w:rPr>
+        <w:t>De seguida, desenvolvemos uma matriz de correlações entre as variáveis meteorológicas e os diferentes tipos de produção energética. Para isso, agregámos a produção horária em valores diários e juntámos estes dados aos dados meteorológicos. A matriz permite observar relações relevantes entre variáveis, como a associação positiva entre velocidade do vento e produção eólica, ou entre luz solar e produção fotovoltaica. De forma complementar, a nebulosidade apresenta uma relação negativa com a produção fotovoltaica, o que está de acordo com o esperado. Este gráfico permite também comparar rapidamente quais os fatores meteorológicos que parecem estar mais associados a cada tecnologia.</w:t>
+      </w:r>
+    </w:p>
+    <w:p>
+      <w:pPr>
+        <w:pStyle w:val="Text"/>
+        <w:rPr>
+          <w:lang w:val="pt-PT"/>
+        </w:rPr>
+      </w:pPr>
+      <w:r>
+        <w:rPr>
+          <w:lang w:val="pt-PT"/>
+        </w:rPr>
+        <w:t>Por fim, implementámos um gráfico de comparação direta entre uma variável meteorológica e uma tecnologia de produção selecionada pelo utilizador. Neste caso, o utilizador escolhe simultaneamente o fator meteorológico e o tipo de produção, podendo comparar as duas séries temporais no mesmo gráfico através de dois eixos verticais. Esta visualização é particularmente útil para analisar períodos concretos em que uma alteração meteorológica parece coincidir com alterações na produção, como dias com maior vento e maior produção eólica, ou períodos com mais luz solar e maior produção fotovoltaica.</w:t>
+      </w:r>
+    </w:p>
+    <w:p>
+      <w:pPr>
+        <w:pStyle w:val="Text"/>
+        <w:rPr>
+          <w:lang w:val="pt-PT"/>
+        </w:rPr>
+      </w:pPr>
+    </w:p>
+    <w:p>
+      <w:pPr>
+        <w:pStyle w:val="Text"/>
+        <w:rPr>
+          <w:lang w:val="pt-PT"/>
+        </w:rPr>
+      </w:pPr>
+      <w:r>
+        <w:rPr>
+          <w:lang w:val="pt-PT"/>
+        </w:rPr>
+        <w:t xml:space="preserve">Na terceira </w:t>
+      </w:r>
+      <w:proofErr w:type="spellStart"/>
+      <w:r>
+        <w:rPr>
+          <w:lang w:val="pt-PT"/>
+        </w:rPr>
+        <w:t>tab</w:t>
+      </w:r>
+      <w:proofErr w:type="spellEnd"/>
+      <w:r>
+        <w:rPr>
+          <w:lang w:val="pt-PT"/>
+        </w:rPr>
+        <w:t xml:space="preserve"> focámo-nos na evolução do preço da eletricidade e na forma como este se relaciona com a produção energética. Começámos por construir uma série temporal do preço médio diário da eletricidade, acrescentando uma média móvel de 7 dias. Esta média móvel permite suavizar oscilações diárias e tornar mais visíveis tendências gerais, períodos de subida ou descida e eventuais momentos de maior instabilidade no preço.</w:t>
+      </w:r>
+    </w:p>
+    <w:p>
+      <w:pPr>
+        <w:pStyle w:val="Text"/>
+        <w:rPr>
+          <w:lang w:val="pt-PT"/>
+        </w:rPr>
+      </w:pPr>
+      <w:r>
+        <w:rPr>
+          <w:lang w:val="pt-PT"/>
+        </w:rPr>
+        <w:t>Para complementar esta análise, implementámos uma visualização baseada em calendário, onde os dias são agrupados em três categorias: preços mais baixos, preços intermédios e preços mais altos. Para obter estes grupos foi aplicado um agrupamento dos dias com base no preço médio diário, sendo depois os grupos ordenados de acordo com o valor médio do preço. O utilizador pode selecionar tanto o grupo de preços que pretende analisar como o ano, permitindo comparar padrões entre 2023, 2024 e 2025.</w:t>
+      </w:r>
+    </w:p>
+    <w:p>
+      <w:pPr>
+        <w:pStyle w:val="Text"/>
+        <w:rPr>
+          <w:lang w:val="pt-PT"/>
+        </w:rPr>
+      </w:pPr>
+      <w:r>
+        <w:rPr>
+          <w:lang w:val="pt-PT"/>
+        </w:rPr>
+        <w:t xml:space="preserve">Ao selecionar um grupo, o calendário destaca os dias pertencentes a esse intervalo de preços e, em simultâneo, apresenta o perfil médio diário de produção para esses mesmos dias, discriminado por energia eólica, hídrica e fotovoltaica. Esta abordagem permite perceber se determinados níveis de preço tendem a estar associados a perfis específicos de produção renovável. Por exemplo, observa-se que os dias de preços </w:t>
+      </w:r>
+      <w:r>
+        <w:rPr>
+          <w:lang w:val="pt-PT"/>
+        </w:rPr>
+        <w:lastRenderedPageBreak/>
+        <w:t>mais baixos tendem a apresentar maior produção eólica média, enquanto os dias de preços mais altos surgem associados a uma menor contribuição média dessa tecnologia. Assim, esta página permite não só acompanhar a evolução do preço ao longo do tempo, mas também relacionar esses valores com a disponibilidade e comportamento das principais fontes renováveis.</w:t>
+      </w:r>
+    </w:p>
+    <w:p>
+      <w:pPr>
+        <w:pStyle w:val="Text"/>
+        <w:rPr>
+          <w:lang w:val="pt-PT"/>
+        </w:rPr>
+      </w:pPr>
     </w:p>
     <w:p>
       <w:pPr>
@@ -4702,7 +4877,6 @@
   <w:style w:type="character" w:default="1" w:styleId="Tipodeletrapredefinidodopargrafo">
     <w:name w:val="Default Paragraph Font"/>
     <w:uiPriority w:val="1"/>
-    <w:semiHidden/>
     <w:unhideWhenUsed/>
   </w:style>
   <w:style w:type="table" w:default="1" w:styleId="Tabelanormal">

</xml_diff>